<commit_message>
Add initial excel activity file
</commit_message>
<xml_diff>
--- a/12615394.docx
+++ b/12615394.docx
@@ -348,8 +348,10 @@
                 <w:sz w:val="28"/>
                 <w:szCs w:val="36"/>
               </w:rPr>
-              <w:t xml:space="preserve"> 27</w:t>
+              <w:t xml:space="preserve"> 21</w:t>
             </w:r>
+            <w:bookmarkStart w:id="0" w:name="_GoBack"/>
+            <w:bookmarkEnd w:id="0"/>
             <w:r>
               <w:rPr>
                 <w:sz w:val="28"/>
@@ -3155,8 +3157,6 @@
               </w:rPr>
               <w:t>Monika</w:t>
             </w:r>
-            <w:bookmarkStart w:id="0" w:name="_GoBack"/>
-            <w:bookmarkEnd w:id="0"/>
           </w:p>
         </w:tc>
         <w:tc>
@@ -27524,7 +27524,7 @@
 </file>
 
 <file path=customXml/itemProps1.xml><?xml version="1.0" encoding="utf-8"?>
-<ds:datastoreItem xmlns:ds="http://schemas.openxmlformats.org/officeDocument/2006/customXml" ds:itemID="{A6AB4007-102F-4151-BB42-C8CA5E3CCD76}">
+<ds:datastoreItem xmlns:ds="http://schemas.openxmlformats.org/officeDocument/2006/customXml" ds:itemID="{1020F224-E0B2-4B9A-BE6A-28AA995E9053}">
   <ds:schemaRefs>
     <ds:schemaRef ds:uri="http://schemas.openxmlformats.org/officeDocument/2006/bibliography"/>
   </ds:schemaRefs>

</xml_diff>